<commit_message>
Add Parts 15-19, contents list, footer, review status; sync tool and checklist; sync Acronyms and Commands docs
Co-Authored-By: Claude Sonnet 5.5 <noreply@anthropic.com>
Claude-Session: https://claude.ai/code/session_01FAGx9qgJn3u4VmZ6fESEv2
</commit_message>
<xml_diff>
--- a/study-notes/Acronyms.docx
+++ b/study-notes/Acronyms.docx
@@ -5704,6 +5704,270 @@
                 <w:color w:val="1A4A17"/>
               </w:rPr>
               <w:t>Layer 2 security feature that validates ARP packets; a violation is one of the ErrDisable trigger causes. Full coverage still a GAP under 5.7.</w:t>
+            </w:r>
+          </w:p>
+        </w:tc>
+      </w:tr>
+      <w:tr>
+        <w:tc>
+          <w:tcPr>
+            <w:tcW w:type="dxa" w:w="2880"/>
+          </w:tcPr>
+          <w:p>
+            <w:r>
+              <w:rPr>
+                <w:b w:val="0"/>
+                <w:i w:val="0"/>
+              </w:rPr>
+              <w:t xml:space="preserve">AS</w:t>
+            </w:r>
+          </w:p>
+        </w:tc>
+        <w:tc>
+          <w:tcPr>
+            <w:tcW w:type="dxa" w:w="2880"/>
+          </w:tcPr>
+          <w:p>
+            <w:r>
+              <w:rPr>
+                <w:b w:val="0"/>
+                <w:i w:val="0"/>
+              </w:rPr>
+              <w:t xml:space="preserve">Autonomous System</w:t>
+            </w:r>
+          </w:p>
+        </w:tc>
+        <w:tc>
+          <w:tcPr>
+            <w:tcW w:type="dxa" w:w="2880"/>
+          </w:tcPr>
+          <w:p>
+            <w:r>
+              <w:rPr>
+                <w:b w:val="0"/>
+                <w:i w:val="0"/>
+              </w:rPr>
+              <w:t xml:space="preserve">A group of routers under a common routing policy. EIGRP neighbours must share the same AS number.</w:t>
+            </w:r>
+          </w:p>
+        </w:tc>
+      </w:tr>
+      <w:tr>
+        <w:tc>
+          <w:tcPr>
+            <w:tcW w:type="dxa" w:w="2880"/>
+          </w:tcPr>
+          <w:p>
+            <w:r>
+              <w:rPr>
+                <w:b w:val="0"/>
+                <w:i w:val="0"/>
+              </w:rPr>
+              <w:t xml:space="preserve">DNA</w:t>
+            </w:r>
+          </w:p>
+        </w:tc>
+        <w:tc>
+          <w:tcPr>
+            <w:tcW w:type="dxa" w:w="2880"/>
+          </w:tcPr>
+          <w:p>
+            <w:r>
+              <w:rPr>
+                <w:b w:val="0"/>
+                <w:i w:val="0"/>
+              </w:rPr>
+              <w:t xml:space="preserve">Digital Network Architecture</w:t>
+            </w:r>
+          </w:p>
+        </w:tc>
+        <w:tc>
+          <w:tcPr>
+            <w:tcW w:type="dxa" w:w="2880"/>
+          </w:tcPr>
+          <w:p>
+            <w:r>
+              <w:rPr>
+                <w:b w:val="0"/>
+                <w:i w:val="0"/>
+              </w:rPr>
+              <w:t xml:space="preserve">Cisco's framework for intent-based networking. DNA Centre is the controller that implements it.</w:t>
+            </w:r>
+          </w:p>
+        </w:tc>
+      </w:tr>
+      <w:tr>
+        <w:tc>
+          <w:tcPr>
+            <w:tcW w:type="dxa" w:w="2880"/>
+          </w:tcPr>
+          <w:p>
+            <w:r>
+              <w:rPr>
+                <w:b w:val="0"/>
+                <w:i w:val="0"/>
+              </w:rPr>
+              <w:t xml:space="preserve">ECMP</w:t>
+            </w:r>
+          </w:p>
+        </w:tc>
+        <w:tc>
+          <w:tcPr>
+            <w:tcW w:type="dxa" w:w="2880"/>
+          </w:tcPr>
+          <w:p>
+            <w:r>
+              <w:rPr>
+                <w:b w:val="0"/>
+                <w:i w:val="0"/>
+              </w:rPr>
+              <w:t xml:space="preserve">Equal Cost Multi-Path</w:t>
+            </w:r>
+          </w:p>
+        </w:tc>
+        <w:tc>
+          <w:tcPr>
+            <w:tcW w:type="dxa" w:w="2880"/>
+          </w:tcPr>
+          <w:p>
+            <w:r>
+              <w:rPr>
+                <w:b w:val="0"/>
+                <w:i w:val="0"/>
+              </w:rPr>
+              <w:t xml:space="preserve">Load balancing across multiple paths with the same metric to a destination.</w:t>
+            </w:r>
+          </w:p>
+        </w:tc>
+      </w:tr>
+      <w:tr>
+        <w:tc>
+          <w:tcPr>
+            <w:tcW w:type="dxa" w:w="2880"/>
+          </w:tcPr>
+          <w:p>
+            <w:r>
+              <w:rPr>
+                <w:b w:val="0"/>
+                <w:i w:val="0"/>
+              </w:rPr>
+              <w:t xml:space="preserve">IS-IS</w:t>
+            </w:r>
+          </w:p>
+        </w:tc>
+        <w:tc>
+          <w:tcPr>
+            <w:tcW w:type="dxa" w:w="2880"/>
+          </w:tcPr>
+          <w:p>
+            <w:r>
+              <w:rPr>
+                <w:b w:val="0"/>
+                <w:i w:val="0"/>
+              </w:rPr>
+              <w:t xml:space="preserve">Intermediate System to Intermediate System</w:t>
+            </w:r>
+          </w:p>
+        </w:tc>
+        <w:tc>
+          <w:tcPr>
+            <w:tcW w:type="dxa" w:w="2880"/>
+          </w:tcPr>
+          <w:p>
+            <w:r>
+              <w:rPr>
+                <w:b w:val="0"/>
+                <w:i w:val="0"/>
+              </w:rPr>
+              <w:t xml:space="preserve">Link-state routing protocol used in SD-Access Greenfield underlay (instead of OSPF).</w:t>
+            </w:r>
+          </w:p>
+        </w:tc>
+      </w:tr>
+      <w:tr>
+        <w:tc>
+          <w:tcPr>
+            <w:tcW w:type="dxa" w:w="2880"/>
+          </w:tcPr>
+          <w:p>
+            <w:r>
+              <w:rPr>
+                <w:b w:val="0"/>
+                <w:i w:val="0"/>
+              </w:rPr>
+              <w:t xml:space="preserve">RIP</w:t>
+            </w:r>
+          </w:p>
+        </w:tc>
+        <w:tc>
+          <w:tcPr>
+            <w:tcW w:type="dxa" w:w="2880"/>
+          </w:tcPr>
+          <w:p>
+            <w:r>
+              <w:rPr>
+                <w:b w:val="0"/>
+                <w:i w:val="0"/>
+              </w:rPr>
+              <w:t xml:space="preserve">Routing Information Protocol</w:t>
+            </w:r>
+          </w:p>
+        </w:tc>
+        <w:tc>
+          <w:tcPr>
+            <w:tcW w:type="dxa" w:w="2880"/>
+          </w:tcPr>
+          <w:p>
+            <w:r>
+              <w:rPr>
+                <w:b w:val="0"/>
+                <w:i w:val="0"/>
+              </w:rPr>
+              <w:t xml:space="preserve">Distance vector IGP that uses hop count as its metric. Max 15 hops.</w:t>
+            </w:r>
+          </w:p>
+        </w:tc>
+      </w:tr>
+      <w:tr>
+        <w:tc>
+          <w:tcPr>
+            <w:tcW w:type="dxa" w:w="2880"/>
+          </w:tcPr>
+          <w:p>
+            <w:r>
+              <w:rPr>
+                <w:b w:val="0"/>
+                <w:i w:val="0"/>
+              </w:rPr>
+              <w:t xml:space="preserve">VM</w:t>
+            </w:r>
+          </w:p>
+        </w:tc>
+        <w:tc>
+          <w:tcPr>
+            <w:tcW w:type="dxa" w:w="2880"/>
+          </w:tcPr>
+          <w:p>
+            <w:r>
+              <w:rPr>
+                <w:b w:val="0"/>
+                <w:i w:val="0"/>
+              </w:rPr>
+              <w:t xml:space="preserve">Virtual Machine</w:t>
+            </w:r>
+          </w:p>
+        </w:tc>
+        <w:tc>
+          <w:tcPr>
+            <w:tcW w:type="dxa" w:w="2880"/>
+          </w:tcPr>
+          <w:p>
+            <w:r>
+              <w:rPr>
+                <w:b w:val="0"/>
+                <w:i w:val="0"/>
+              </w:rPr>
+              <w:t xml:space="preserve">Software-based computer running on physical hardware. Commonly provisioned by tools like Terraform.</w:t>
             </w:r>
           </w:p>
         </w:tc>

</xml_diff>

<commit_message>
Apply review round 2: fixes, Part 9 reorder, blueprint index, real-world pointers, A4 page size
Co-Authored-By: Claude Sonnet 5.5 <noreply@anthropic.com>
Claude-Session: https://claude.ai/code/session_01FAGx9qgJn3u4VmZ6fESEv2
</commit_message>
<xml_diff>
--- a/study-notes/Acronyms.docx
+++ b/study-notes/Acronyms.docx
@@ -5975,8 +5975,8 @@
     </w:tbl>
     <w:p/>
     <w:sectPr>
-      <w:pgSz w:w="12240" w:h="15840"/>
-      <w:pgMar w:top="1440" w:right="1800" w:bottom="1440" w:left="1800" w:header="720" w:footer="720" w:gutter="0"/>
+      <w:pgSz w:w="11906" w:h="16838"/>
+      <w:pgMar w:top="1440" w:right="1633" w:bottom="1440" w:left="1633" w:header="720" w:footer="720" w:gutter="0"/>
       <w:cols w:space="720"/>
       <w:docGrid w:linePitch="360"/>
     </w:sectPr>

</xml_diff>

<commit_message>
Add Dynamic Routing video notes to Part 9; sync Commands and Acronyms docs; keep the capture sheet
Co-Authored-By: Claude Sonnet 5.5 <noreply@anthropic.com>
Claude-Session: https://claude.ai/code/session_01FAGx9qgJn3u4VmZ6fESEv2
</commit_message>
<xml_diff>
--- a/study-notes/Acronyms.docx
+++ b/study-notes/Acronyms.docx
@@ -5968,6 +5968,182 @@
                 <w:i w:val="0"/>
               </w:rPr>
               <w:t xml:space="preserve">Software-based computer running on physical hardware. Commonly provisioned by tools like Terraform.</w:t>
+            </w:r>
+          </w:p>
+        </w:tc>
+      </w:tr>
+      <w:tr>
+        <w:tc>
+          <w:tcPr>
+            <w:tcW w:type="dxa" w:w="2880"/>
+          </w:tcPr>
+          <w:p>
+            <w:r>
+              <w:rPr>
+                <w:b w:val="0"/>
+                <w:i w:val="0"/>
+              </w:rPr>
+              <w:t xml:space="preserve">IGP</w:t>
+            </w:r>
+          </w:p>
+        </w:tc>
+        <w:tc>
+          <w:tcPr>
+            <w:tcW w:type="dxa" w:w="2880"/>
+          </w:tcPr>
+          <w:p>
+            <w:r>
+              <w:rPr>
+                <w:b w:val="0"/>
+                <w:i w:val="0"/>
+              </w:rPr>
+              <w:t xml:space="preserve">Interior Gateway Protocol</w:t>
+            </w:r>
+          </w:p>
+        </w:tc>
+        <w:tc>
+          <w:tcPr>
+            <w:tcW w:type="dxa" w:w="2880"/>
+          </w:tcPr>
+          <w:p>
+            <w:r>
+              <w:rPr>
+                <w:b w:val="0"/>
+                <w:i w:val="0"/>
+              </w:rPr>
+              <w:t xml:space="preserve">Routing protocol that shares routes within a single autonomous system.</w:t>
+            </w:r>
+          </w:p>
+        </w:tc>
+      </w:tr>
+      <w:tr>
+        <w:tc>
+          <w:tcPr>
+            <w:tcW w:type="dxa" w:w="2880"/>
+          </w:tcPr>
+          <w:p>
+            <w:r>
+              <w:rPr>
+                <w:b w:val="0"/>
+                <w:i w:val="0"/>
+              </w:rPr>
+              <w:t xml:space="preserve">EGP</w:t>
+            </w:r>
+          </w:p>
+        </w:tc>
+        <w:tc>
+          <w:tcPr>
+            <w:tcW w:type="dxa" w:w="2880"/>
+          </w:tcPr>
+          <w:p>
+            <w:r>
+              <w:rPr>
+                <w:b w:val="0"/>
+                <w:i w:val="0"/>
+              </w:rPr>
+              <w:t xml:space="preserve">Exterior Gateway Protocol</w:t>
+            </w:r>
+          </w:p>
+        </w:tc>
+        <w:tc>
+          <w:tcPr>
+            <w:tcW w:type="dxa" w:w="2880"/>
+          </w:tcPr>
+          <w:p>
+            <w:r>
+              <w:rPr>
+                <w:b w:val="0"/>
+                <w:i w:val="0"/>
+              </w:rPr>
+              <w:t xml:space="preserve">Routing protocol that shares routes between different autonomous systems.</w:t>
+            </w:r>
+          </w:p>
+        </w:tc>
+      </w:tr>
+      <w:tr>
+        <w:tc>
+          <w:tcPr>
+            <w:tcW w:type="dxa" w:w="2880"/>
+          </w:tcPr>
+          <w:p>
+            <w:r>
+              <w:rPr>
+                <w:b w:val="0"/>
+                <w:i w:val="0"/>
+              </w:rPr>
+              <w:t xml:space="preserve">AD</w:t>
+            </w:r>
+          </w:p>
+        </w:tc>
+        <w:tc>
+          <w:tcPr>
+            <w:tcW w:type="dxa" w:w="2880"/>
+          </w:tcPr>
+          <w:p>
+            <w:r>
+              <w:rPr>
+                <w:b w:val="0"/>
+                <w:i w:val="0"/>
+              </w:rPr>
+              <w:t xml:space="preserve">Administrative Distance</w:t>
+            </w:r>
+          </w:p>
+        </w:tc>
+        <w:tc>
+          <w:tcPr>
+            <w:tcW w:type="dxa" w:w="2880"/>
+          </w:tcPr>
+          <w:p>
+            <w:r>
+              <w:rPr>
+                <w:b w:val="0"/>
+                <w:i w:val="0"/>
+              </w:rPr>
+              <w:t xml:space="preserve">Value that ranks how trustworthy a routing source is. Lower is preferred.</w:t>
+            </w:r>
+          </w:p>
+        </w:tc>
+      </w:tr>
+      <w:tr>
+        <w:tc>
+          <w:tcPr>
+            <w:tcW w:type="dxa" w:w="2880"/>
+          </w:tcPr>
+          <w:p>
+            <w:r>
+              <w:rPr>
+                <w:b w:val="0"/>
+                <w:i w:val="0"/>
+              </w:rPr>
+              <w:t xml:space="preserve">IGRP</w:t>
+            </w:r>
+          </w:p>
+        </w:tc>
+        <w:tc>
+          <w:tcPr>
+            <w:tcW w:type="dxa" w:w="2880"/>
+          </w:tcPr>
+          <w:p>
+            <w:r>
+              <w:rPr>
+                <w:b w:val="0"/>
+                <w:i w:val="0"/>
+              </w:rPr>
+              <w:t xml:space="preserve">Interior Gateway Routing Protocol</w:t>
+            </w:r>
+          </w:p>
+        </w:tc>
+        <w:tc>
+          <w:tcPr>
+            <w:tcW w:type="dxa" w:w="2880"/>
+          </w:tcPr>
+          <w:p>
+            <w:r>
+              <w:rPr>
+                <w:b w:val="0"/>
+                <w:i w:val="0"/>
+              </w:rPr>
+              <w:t xml:space="preserve">Cisco's older proprietary distance vector protocol, updated to EIGRP.</w:t>
             </w:r>
           </w:p>
         </w:tc>

</xml_diff>